<commit_message>
v1 review fixes: S4 contradiction + polish + ref metadata + rebuild docx
Mandatory fix:
- S4 first paragraph: 'transfers to unseen distributions explicitly added
  during training' (self-contradiction) -> 'beyond the cohort added during
  training', consistent with Abstract. Applied to EN + ZH.

Polish:
- S2.3: '6 GB GPU memory budget available for training' -> 'available 6 GB
  GPU memory' (EN + ZH)
- Supplement S1b: 'Per-nodule values' -> 'Nodule-level values'

Ref metadata verified via Crossref (EN + ZH):
- ref 21 UMB: 52(6) -> 52(8):1763-1774 (was wrong issue + missing pages)
- ref 22 RCAF: 16:16204 -> 16:22408 (wrong article number)

Rebuilt manuscript_v2.docx and manuscript_zh.docx.

Verified: contradiction 0 hits, refs 22/22, gates OK.
</commit_message>
<xml_diff>
--- a/paper/output/doc/manuscript_zh.docx
+++ b/paper/output/doc/manuscript_zh.docx
@@ -220,7 +220,7 @@
         <w:spacing w:after="120"/>
       </w:pPr>
       <w:r>
-        <w:t>多模态分类器由三部分组成。图像编码器为在 ImageNet 上预训练的 EfficientNetV2-S 主干，其最终分类层替换为生成 512 维嵌入的投影头。选择 EfficientNetV2-S 作为图像编码器，是因为其复合缩放设计提供了良好的准确率/效率权衡，适合训练可用的 6 GB GPU 显存预算，且已广泛用于医学图像分类（包括甲状腺超声）[8]；我们未进行架构搜索，其他主干可能有不同表现（见第 4 节"局限性"）。临床编码器为多层感知机，将五维临床向量（TI-RADS 总分、结节宽、结节高、年龄、性别）映射为 64 维嵌入。两个嵌入拼接后送入隐藏维数为 256 和 128、dropout 为 0.3 的预测头，产生恶性概率。比较了三种消融配置：纯图像（临床分支禁用）、纯临床（图像分支禁用）和融合（两个分支均启用）。</w:t>
+        <w:t>多模态分类器由三部分组成。图像编码器为在 ImageNet 上预训练的 EfficientNetV2-S 主干，其最终分类层替换为生成 512 维嵌入的投影头。选择 EfficientNetV2-S 作为图像编码器，是因为其复合缩放设计提供了良好的准确率/效率权衡，适合可用的 6 GB GPU 显存，且已广泛用于医学图像分类（包括甲状腺超声）[8]；我们未进行架构搜索，其他主干可能有不同表现（见第 4 节"局限性"）。临床编码器为多层感知机，将五维临床向量（TI-RADS 总分、结节宽、结节高、年龄、性别）映射为 64 维嵌入。两个嵌入拼接后送入隐藏维数为 256 和 128、dropout 为 0.3 的预测头，产生恶性概率。比较了三种消融配置：纯图像（临床分支禁用）、纯临床（图像分支禁用）和融合（两个分支均启用）。</w:t>
       </w:r>
     </w:p>
     <w:p>
@@ -5918,7 +5918,7 @@
         <w:spacing w:after="120"/>
       </w:pPr>
       <w:r>
-        <w:t>我们系统评估了一个将超声图像特征与结构化临床特征相结合、用于甲状腺结节恶性分类的多模态框架，并量化了其在四个公共数据集上的泛化能力。得出了三项主要发现。其一，在单一大数据集上训练的纯图像模型内部判别力高（测试 AUC 0.920），但在独立外部数据集上性能显著下降（AUC 0.713），量化了单队列评估中不可见的 0.21 跨数据集域漂移差距。其二，在两个数据集的合并训练图像上联合训练（7,129 张：6,379 张训练加 750 张验证）在 TN3K 上恢复了约一半差距（外部 AUC 0.814 对匹配官方测试的 0.729，Δ = +0.085），内部变化适中（AUC 0.931，+0.01）。其三，在第二个完全独立的病理确诊队列（Thy-Wise；3,954 个结节）上，联合训练提供了相当的增益（结节级 AUC 0.608 → 0.710，Δ = +0.102），表明外部性能高度依赖队列，且联合训练的好处可转移到未见分布。在整个分析中，我们在判别力之外还报告校准和决策曲线指标，并在 ThyroidXL 队列上报告纯图像、纯临床和融合模型的三臂消融（见 3.5 节），弥补了该领域常见的报告空白。</w:t>
+        <w:t>我们系统评估了一个将超声图像特征与结构化临床特征相结合、用于甲状腺结节恶性分类的多模态框架，并量化了其在四个公共数据集上的泛化能力。得出了三项主要发现。其一，在单一大数据集上训练的纯图像模型内部判别力高（测试 AUC 0.920），但在独立外部数据集上性能显著下降（AUC 0.713），量化了单队列评估中不可见的 0.21 跨数据集域漂移差距。其二，在两个数据集的合并训练图像上联合训练（7,129 张：6,379 张训练加 750 张验证）在 TN3K 上恢复了约一半差距（外部 AUC 0.814 对匹配官方测试的 0.729，Δ = +0.085），内部变化适中（AUC 0.931，+0.01）。其三，在第二个完全独立的病理确诊队列（Thy-Wise；3,954 个结节）上，联合训练提供了相当的增益（结节级 AUC 0.608 → 0.710，Δ = +0.102），表明外部性能高度依赖队列，且联合训练的好处可转移到训练中新增队列之外的未见分布。在整个分析中，我们在判别力之外还报告校准和决策曲线指标，并在 ThyroidXL 队列上报告纯图像、纯临床和融合模型的三臂消融（见 3.5 节），弥补了该领域常见的报告空白。</w:t>
       </w:r>
     </w:p>
     <w:p>
@@ -6481,7 +6481,7 @@
         <w:t xml:space="preserve">21. </w:t>
       </w:r>
       <w:r>
-        <w:t>Li Y, Yan X, Li J, et al. Differentiating mummified thyroid nodules from papillary thyroid carcinoma: a machine learning approach using multi-modal ultrasound radiomics. *Ultrasound in Medicine and Biology*. 2026;52(6). doi:10.1016/j.ultrasmedbio.2026.05.007.</w:t>
+        <w:t>Li Y, Yan X, Li J, et al. Differentiating mummified thyroid nodules from papillary thyroid carcinoma: a machine learning approach using multi-modal ultrasound radiomics. *Ultrasound in Medicine and Biology*. 2026;52(8):1763–1774. doi:10.1016/j.ultrasmedbio.2026.05.007.</w:t>
       </w:r>
     </w:p>
     <w:p>
@@ -6492,7 +6492,7 @@
         <w:t xml:space="preserve">22. </w:t>
       </w:r>
       <w:r>
-        <w:t>Sherif M, Elsayed EK, Deif MA. RCAF for patient-level thyroid ultrasound malignancy prediction under leakage-free evaluation and calibration. *Scientific Reports*. 2026;16:16204. doi:10.1038/s41598-026-61342-8.</w:t>
+        <w:t>Sherif M, Elsayed EK, Deif MA. RCAF for patient-level thyroid ultrasound malignancy prediction under leakage-free evaluation and calibration. *Scientific Reports*. 2026;16:22408. doi:10.1038/s41598-026-61342-8.</w:t>
       </w:r>
     </w:p>
     <w:sectPr>

</xml_diff>

<commit_message>
docx: add citation hyperlinks (in-text [n] jumps to References)
- md_to_docx.py: add_internal_hyperlink renders [n] citations as Word internal
  hyperlinks (w:hyperlink w:anchor), each reference entry gets a _RefN bookmark
- 38 in-text citation links + 22 reference bookmarks, 1:1 mapping verified
  in the XML
- Rebuilt manuscript.docx, manuscript_v2.docx (EN) and manuscript_zh.docx (ZH)
- Ctrl+click in Word now jumps from [n] to the corresponding reference
</commit_message>
<xml_diff>
--- a/paper/output/doc/manuscript_zh.docx
+++ b/paper/output/doc/manuscript_zh.docx
@@ -100,7 +100,49 @@
         <w:spacing w:after="120"/>
       </w:pPr>
       <w:r>
-        <w:t>甲状腺结节是最常见的内分泌发现之一：一项一般人群荟萃分析估计汇总患病率为 24.8%（95% CI 21.4–28.6%）[1]，但绝大多数为良性。这一高患病率加之甲状腺癌发病率的上升，引发了关于过度诊断和不必要手术的担忧 [2]。甲状腺超声因无创、无辐射且广泛可得，仍是结节评估的一线影像手段；然而判读具主观性且高度依赖操作者，良恶性结节的声像图特征重叠也限制了诊断可重复性 [3]。</w:t>
+        <w:t>甲状腺结节是最常见的内分泌发现之一：一项一般人群荟萃分析估计汇总患病率为 24.8%（95% CI 21.4–28.6%）</w:t>
+      </w:r>
+      <w:r/>
+      <w:hyperlink w:anchor="_Ref1">
+        <w:r>
+          <w:rPr>
+            <w:color w:val="0563C1"/>
+            <w:u w:val="single"/>
+          </w:rPr>
+          <w:t>1</w:t>
+        </w:r>
+      </w:hyperlink>
+      <w:r/>
+      <w:r>
+        <w:t xml:space="preserve">，但绝大多数为良性。这一高患病率加之甲状腺癌发病率的上升，引发了关于过度诊断和不必要手术的担忧 </w:t>
+      </w:r>
+      <w:r/>
+      <w:hyperlink w:anchor="_Ref2">
+        <w:r>
+          <w:rPr>
+            <w:color w:val="0563C1"/>
+            <w:u w:val="single"/>
+          </w:rPr>
+          <w:t>2</w:t>
+        </w:r>
+      </w:hyperlink>
+      <w:r/>
+      <w:r>
+        <w:t xml:space="preserve">。甲状腺超声因无创、无辐射且广泛可得，仍是结节评估的一线影像手段；然而判读具主观性且高度依赖操作者，良恶性结节的声像图特征重叠也限制了诊断可重复性 </w:t>
+      </w:r>
+      <w:r/>
+      <w:hyperlink w:anchor="_Ref3">
+        <w:r>
+          <w:rPr>
+            <w:color w:val="0563C1"/>
+            <w:u w:val="single"/>
+          </w:rPr>
+          <w:t>3</w:t>
+        </w:r>
+      </w:hyperlink>
+      <w:r/>
+      <w:r>
+        <w:t>。</w:t>
       </w:r>
     </w:p>
     <w:p>
@@ -108,7 +150,139 @@
         <w:spacing w:after="120"/>
       </w:pPr>
       <w:r>
-        <w:t>深度学习已成为支持甲状腺结节分类、分割与检测的有前景工具 [4,5,6]。大量基于卷积神经网络和视觉变换器的模型在内部测试集上报告了高诊断准确率 [7,8]。若干开放数据集加速了这一进展，包括 DDTI（637 张）[9]、TN3K（3,493 张）[10,11]、TN5000 数据集（5,000 张，有活检确认）[12]，以及专家标注的 ThyroidXL 基准（11,635 张）[13]。尽管有此进展，文献中仍存在三点局限。第一，多数研究在单一数据集上评估，同机构训练的模型会因医院、超声设备和患者人群间的域漂移而高估真实世界性能。第二，绝大多数模型为纯图像模型，弃用了放射科医生常规使用的结构化临床信息，如 ACR TI-RADS 描述符。第三，已报道模型很少包含校准指标或决策曲线分析，而这些对临床效用评估至关重要。</w:t>
+        <w:t xml:space="preserve">深度学习已成为支持甲状腺结节分类、分割与检测的有前景工具 </w:t>
+      </w:r>
+      <w:r/>
+      <w:hyperlink w:anchor="_Ref4">
+        <w:r>
+          <w:rPr>
+            <w:color w:val="0563C1"/>
+            <w:u w:val="single"/>
+          </w:rPr>
+          <w:t>4</w:t>
+        </w:r>
+      </w:hyperlink>
+      <w:r>
+        <w:t>,</w:t>
+      </w:r>
+      <w:hyperlink w:anchor="_Ref5">
+        <w:r>
+          <w:rPr>
+            <w:color w:val="0563C1"/>
+            <w:u w:val="single"/>
+          </w:rPr>
+          <w:t>5</w:t>
+        </w:r>
+      </w:hyperlink>
+      <w:r>
+        <w:t>,</w:t>
+      </w:r>
+      <w:hyperlink w:anchor="_Ref6">
+        <w:r>
+          <w:rPr>
+            <w:color w:val="0563C1"/>
+            <w:u w:val="single"/>
+          </w:rPr>
+          <w:t>6</w:t>
+        </w:r>
+      </w:hyperlink>
+      <w:r/>
+      <w:r>
+        <w:t xml:space="preserve">。大量基于卷积神经网络和视觉变换器的模型在内部测试集上报告了高诊断准确率 </w:t>
+      </w:r>
+      <w:r/>
+      <w:hyperlink w:anchor="_Ref7">
+        <w:r>
+          <w:rPr>
+            <w:color w:val="0563C1"/>
+            <w:u w:val="single"/>
+          </w:rPr>
+          <w:t>7</w:t>
+        </w:r>
+      </w:hyperlink>
+      <w:r>
+        <w:t>,</w:t>
+      </w:r>
+      <w:hyperlink w:anchor="_Ref8">
+        <w:r>
+          <w:rPr>
+            <w:color w:val="0563C1"/>
+            <w:u w:val="single"/>
+          </w:rPr>
+          <w:t>8</w:t>
+        </w:r>
+      </w:hyperlink>
+      <w:r/>
+      <w:r>
+        <w:t>。若干开放数据集加速了这一进展，包括 DDTI（637 张）</w:t>
+      </w:r>
+      <w:r/>
+      <w:hyperlink w:anchor="_Ref9">
+        <w:r>
+          <w:rPr>
+            <w:color w:val="0563C1"/>
+            <w:u w:val="single"/>
+          </w:rPr>
+          <w:t>9</w:t>
+        </w:r>
+      </w:hyperlink>
+      <w:r/>
+      <w:r>
+        <w:t>、TN3K（3,493 张）</w:t>
+      </w:r>
+      <w:r/>
+      <w:hyperlink w:anchor="_Ref10">
+        <w:r>
+          <w:rPr>
+            <w:color w:val="0563C1"/>
+            <w:u w:val="single"/>
+          </w:rPr>
+          <w:t>10</w:t>
+        </w:r>
+      </w:hyperlink>
+      <w:r>
+        <w:t>,</w:t>
+      </w:r>
+      <w:hyperlink w:anchor="_Ref11">
+        <w:r>
+          <w:rPr>
+            <w:color w:val="0563C1"/>
+            <w:u w:val="single"/>
+          </w:rPr>
+          <w:t>11</w:t>
+        </w:r>
+      </w:hyperlink>
+      <w:r/>
+      <w:r>
+        <w:t>、TN5000 数据集（5,000 张，有活检确认）</w:t>
+      </w:r>
+      <w:r/>
+      <w:hyperlink w:anchor="_Ref12">
+        <w:r>
+          <w:rPr>
+            <w:color w:val="0563C1"/>
+            <w:u w:val="single"/>
+          </w:rPr>
+          <w:t>12</w:t>
+        </w:r>
+      </w:hyperlink>
+      <w:r/>
+      <w:r>
+        <w:t>，以及专家标注的 ThyroidXL 基准（11,635 张）</w:t>
+      </w:r>
+      <w:r/>
+      <w:hyperlink w:anchor="_Ref13">
+        <w:r>
+          <w:rPr>
+            <w:color w:val="0563C1"/>
+            <w:u w:val="single"/>
+          </w:rPr>
+          <w:t>13</w:t>
+        </w:r>
+      </w:hyperlink>
+      <w:r/>
+      <w:r>
+        <w:t>。尽管有此进展，文献中仍存在三点局限。第一，多数研究在单一数据集上评估，同机构训练的模型会因医院、超声设备和患者人群间的域漂移而高估真实世界性能。第二，绝大多数模型为纯图像模型，弃用了放射科医生常规使用的结构化临床信息，如 ACR TI-RADS 描述符。第三，已报道模型很少包含校准指标或决策曲线分析，而这些对临床效用评估至关重要。</w:t>
       </w:r>
     </w:p>
     <w:p>
@@ -116,7 +290,21 @@
         <w:spacing w:after="120"/>
       </w:pPr>
       <w:r>
-        <w:t>ACR TI-RADS 词表提供了标准化、与设备无关的结节成分、回声、形态、边缘和强回声灶描述，其总分是恶性风险的已验证预测因子 [3]。由于这些特征按语义而非图像统计定义，原则上受采集变异的影响小于原始像素。将这类结构化临床特征与图像深度特征融合能否改善分类、增益是否跨数据集稳健，尚未在公共多队列数据上系统检验。因此，我们评估了一个将图像特征与结构化临床特征（ACR TI-RADS 评分、结节宽和高、年龄、性别）融合的多模态框架，并量化了融合模型相对纯图像和纯临床配置的内部增益与行为。</w:t>
+        <w:t xml:space="preserve">ACR TI-RADS 词表提供了标准化、与设备无关的结节成分、回声、形态、边缘和强回声灶描述，其总分是恶性风险的已验证预测因子 </w:t>
+      </w:r>
+      <w:r/>
+      <w:hyperlink w:anchor="_Ref3">
+        <w:r>
+          <w:rPr>
+            <w:color w:val="0563C1"/>
+            <w:u w:val="single"/>
+          </w:rPr>
+          <w:t>3</w:t>
+        </w:r>
+      </w:hyperlink>
+      <w:r/>
+      <w:r>
+        <w:t>。由于这些特征按语义而非图像统计定义，原则上受采集变异的影响小于原始像素。将这类结构化临床特征与图像深度特征融合能否改善分类、增益是否跨数据集稳健，尚未在公共多队列数据上系统检验。因此，我们评估了一个将图像特征与结构化临床特征（ACR TI-RADS 评分、结节宽和高、年龄、性别）融合的多模态框架，并量化了融合模型相对纯图像和纯临床配置的内部增益与行为。</w:t>
       </w:r>
     </w:p>
     <w:p>
@@ -156,7 +344,21 @@
         <w:spacing w:after="120"/>
       </w:pPr>
       <w:r>
-        <w:t>TN5000 数据集（Zhang 等，Scientific Data，2025）[12] 含 5,000 张甲状腺结节 B 型超声图像，带专家放射科医生标签和活检确认，专为检测与分类设计。在本版本中，1,426 张为良性、3,574 张为恶性。我们将 TN5000 用于模型开发，按患者分组随机划分为 70%/15%/15% 的训练、验证和内部测试集。</w:t>
+        <w:t>TN5000 数据集（Zhang 等，Scientific Data，2025）</w:t>
+      </w:r>
+      <w:r/>
+      <w:hyperlink w:anchor="_Ref12">
+        <w:r>
+          <w:rPr>
+            <w:color w:val="0563C1"/>
+            <w:u w:val="single"/>
+          </w:rPr>
+          <w:t>12</w:t>
+        </w:r>
+      </w:hyperlink>
+      <w:r/>
+      <w:r>
+        <w:t xml:space="preserve"> 含 5,000 张甲状腺结节 B 型超声图像，带专家放射科医生标签和活检确认，专为检测与分类设计。在本版本中，1,426 张为良性、3,574 张为恶性。我们将 TN5000 用于模型开发，按患者分组随机划分为 70%/15%/15% 的训练、验证和内部测试集。</w:t>
       </w:r>
     </w:p>
     <w:p>
@@ -164,7 +366,33 @@
         <w:spacing w:after="120"/>
       </w:pPr>
       <w:r>
-        <w:t>TN3K 数据集（Gong 等，ISBI 2021 / CBM 2022）[10,11] 含来自 2,421 名患者、由多种超声设备采集的 3,493 张超声图像，带有分割掩膜和良/恶性标签（0 = 良性，1 = 恶性）。TN3K 用作外部验证队列以评估跨数据集泛化。单数据集评估中，全部 3,493 张 TN3K 图像（2,283 张良性、1,210 张恶性）均不参与训练。联合训练实验中，TN3K 训练图像（n = 2,879）被加入训练池，官方 TN3K 测试集（n = 614）用于外部评估。</w:t>
+        <w:t>TN3K 数据集（Gong 等，ISBI 2021 / CBM 2022）</w:t>
+      </w:r>
+      <w:r/>
+      <w:hyperlink w:anchor="_Ref10">
+        <w:r>
+          <w:rPr>
+            <w:color w:val="0563C1"/>
+            <w:u w:val="single"/>
+          </w:rPr>
+          <w:t>10</w:t>
+        </w:r>
+      </w:hyperlink>
+      <w:r>
+        <w:t>,</w:t>
+      </w:r>
+      <w:hyperlink w:anchor="_Ref11">
+        <w:r>
+          <w:rPr>
+            <w:color w:val="0563C1"/>
+            <w:u w:val="single"/>
+          </w:rPr>
+          <w:t>11</w:t>
+        </w:r>
+      </w:hyperlink>
+      <w:r/>
+      <w:r>
+        <w:t xml:space="preserve"> 含来自 2,421 名患者、由多种超声设备采集的 3,493 张超声图像，带有分割掩膜和良/恶性标签（0 = 良性，1 = 恶性）。TN3K 用作外部验证队列以评估跨数据集泛化。单数据集评估中，全部 3,493 张 TN3K 图像（2,283 张良性、1,210 张恶性）均不参与训练。联合训练实验中，TN3K 训练图像（n = 2,879）被加入训练池，官方 TN3K 测试集（n = 614）用于外部评估。</w:t>
       </w:r>
     </w:p>
     <w:p>
@@ -172,7 +400,21 @@
         <w:spacing w:after="120"/>
       </w:pPr>
       <w:r>
-        <w:t>Thy-Wise 数据集（Jin 等，International Journal of Cancer，2022）[14] 含暨南大学第一附属医院 3,954 个甲状腺结节的 B 型超声图像，以 CC BY 4.0 许可发布。每个结节由一张或多张图像表示（中位数 7，范围 1–48），在一次检查中采集，良/恶性类别经病理确认。我们将 Thy-Wise 仅用作第二个外部验证队列；因结节可能由多张图像描绘，所有 Thy-Wise 评估均在结节级聚合（见 2.5 节）。排除公共存档中损坏且无法解码的 25 张图像后，剩余 3,954 个结节（2,876 个良性、1,078 个恶性）和 29,070 张图像（20,680 张良性、8,390 张恶性）用于分析。</w:t>
+        <w:t>Thy-Wise 数据集（Jin 等，International Journal of Cancer，2022）</w:t>
+      </w:r>
+      <w:r/>
+      <w:hyperlink w:anchor="_Ref14">
+        <w:r>
+          <w:rPr>
+            <w:color w:val="0563C1"/>
+            <w:u w:val="single"/>
+          </w:rPr>
+          <w:t>14</w:t>
+        </w:r>
+      </w:hyperlink>
+      <w:r/>
+      <w:r>
+        <w:t xml:space="preserve"> 含暨南大学第一附属医院 3,954 个甲状腺结节的 B 型超声图像，以 CC BY 4.0 许可发布。每个结节由一张或多张图像表示（中位数 7，范围 1–48），在一次检查中采集，良/恶性类别经病理确认。我们将 Thy-Wise 仅用作第二个外部验证队列；因结节可能由多张图像描绘，所有 Thy-Wise 评估均在结节级聚合（见 2.5 节）。排除公共存档中损坏且无法解码的 25 张图像后，剩余 3,954 个结节（2,876 个良性、1,078 个恶性）和 29,070 张图像（20,680 张良性、8,390 张恶性）用于分析。</w:t>
       </w:r>
     </w:p>
     <w:p>
@@ -180,7 +422,21 @@
         <w:spacing w:after="120"/>
       </w:pPr>
       <w:r>
-        <w:t>ThyroidXL 数据集（Duong 等，MICCAI 2025）[13] 含在越南国家内分泌医院用单一超声系统（Hitachi Aloka Arietta V70）采集的 4,093 个甲状腺结节的 11,635 张 B 型超声图像，以受限访问加研究许可方式发布，良/恶性标签源自细胞学与病理学检查。对本研究的融合部分至关重要的一点是，ThyroidXL 为每个结节提供了专家 ACR TI-RADS 总分（1–5）、以毫米为单位的结节尺寸、患者年龄和性别。作者将数据集分为开发（9,541 张图像，3,354 名患者）和测试（2,094 张图像，739 名患者）队列，无患者重叠。我们将 ThyroidXL 仅用于融合消融（2.2 节、3.5 节）：开发队列按患者在患者级分为训练（n = 8,615 张图像）和验证（n = 926 张图像）集，官方测试队列（739 个结节）保留用于评估。因结节可能由多张图像表示，ThyroidXL 评估通过对图像级概率取平均聚合到结节级（见 2.5 节）。</w:t>
+        <w:t>ThyroidXL 数据集（Duong 等，MICCAI 2025）</w:t>
+      </w:r>
+      <w:r/>
+      <w:hyperlink w:anchor="_Ref13">
+        <w:r>
+          <w:rPr>
+            <w:color w:val="0563C1"/>
+            <w:u w:val="single"/>
+          </w:rPr>
+          <w:t>13</w:t>
+        </w:r>
+      </w:hyperlink>
+      <w:r/>
+      <w:r>
+        <w:t xml:space="preserve"> 含在越南国家内分泌医院用单一超声系统（Hitachi Aloka Arietta V70）采集的 4,093 个甲状腺结节的 11,635 张 B 型超声图像，以受限访问加研究许可方式发布，良/恶性标签源自细胞学与病理学检查。对本研究的融合部分至关重要的一点是，ThyroidXL 为每个结节提供了专家 ACR TI-RADS 总分（1–5）、以毫米为单位的结节尺寸、患者年龄和性别。作者将数据集分为开发（9,541 张图像，3,354 名患者）和测试（2,094 张图像，739 名患者）队列，无患者重叠。我们将 ThyroidXL 仅用于融合消融（2.2 节、3.5 节）：开发队列按患者在患者级分为训练（n = 8,615 张图像）和验证（n = 926 张图像）集，官方测试队列（739 个结节）保留用于评估。因结节可能由多张图像表示，ThyroidXL 评估通过对图像级概率取平均聚合到结节级（见 2.5 节）。</w:t>
       </w:r>
     </w:p>
     <w:p>
@@ -204,7 +460,21 @@
         <w:spacing w:after="120"/>
       </w:pPr>
       <w:r>
-        <w:t>五项结构化临床特征用作融合模型的临床输入。ThyroidXL 数据集为每个结节提供专家 ACR TI-RADS 总分（1–5）、采集时记录的以毫米为单位的结节宽和高、患者年龄（岁）和性别（1 = 男，2 = 女）。这五项值——TI-RADS 总分、结节宽、结节高、年龄、性别——拼接成一个五维临床向量。ACR TI-RADS 总分是一种与设备无关、按语义定义的风险分层汇总，源自成分、回声、形态、边缘和强回声灶描述符 [3]，因此预期受采集变异的影响小于原始像素统计。与图像模态不同，这些特征在推理时无需结节分割或手动病灶裁剪。缺失的临床值编码为零，ThyroidXL 中无结节缺少这五项特征。</w:t>
+        <w:t xml:space="preserve">五项结构化临床特征用作融合模型的临床输入。ThyroidXL 数据集为每个结节提供专家 ACR TI-RADS 总分（1–5）、采集时记录的以毫米为单位的结节宽和高、患者年龄（岁）和性别（1 = 男，2 = 女）。这五项值——TI-RADS 总分、结节宽、结节高、年龄、性别——拼接成一个五维临床向量。ACR TI-RADS 总分是一种与设备无关、按语义定义的风险分层汇总，源自成分、回声、形态、边缘和强回声灶描述符 </w:t>
+      </w:r>
+      <w:r/>
+      <w:hyperlink w:anchor="_Ref3">
+        <w:r>
+          <w:rPr>
+            <w:color w:val="0563C1"/>
+            <w:u w:val="single"/>
+          </w:rPr>
+          <w:t>3</w:t>
+        </w:r>
+      </w:hyperlink>
+      <w:r/>
+      <w:r>
+        <w:t>，因此预期受采集变异的影响小于原始像素统计。与图像模态不同，这些特征在推理时无需结节分割或手动病灶裁剪。缺失的临床值编码为零，ThyroidXL 中无结节缺少这五项特征。</w:t>
       </w:r>
     </w:p>
     <w:p>
@@ -220,7 +490,21 @@
         <w:spacing w:after="120"/>
       </w:pPr>
       <w:r>
-        <w:t>多模态分类器由三部分组成。图像编码器为在 ImageNet 上预训练的 EfficientNetV2-S 主干，其最终分类层替换为生成 512 维嵌入的投影头。选择 EfficientNetV2-S 作为图像编码器，是因为其复合缩放设计提供了良好的准确率/效率权衡，适合可用的 6 GB GPU 显存，且已广泛用于医学图像分类（包括甲状腺超声）[8]；我们未进行架构搜索，其他主干可能有不同表现（见第 4 节"局限性"）。临床编码器为多层感知机，将五维临床向量（TI-RADS 总分、结节宽、结节高、年龄、性别）映射为 64 维嵌入。两个嵌入拼接后送入隐藏维数为 256 和 128、dropout 为 0.3 的预测头，产生恶性概率。比较了三种消融配置：纯图像（临床分支禁用）、纯临床（图像分支禁用）和融合（两个分支均启用）。</w:t>
+        <w:t>多模态分类器由三部分组成。图像编码器为在 ImageNet 上预训练的 EfficientNetV2-S 主干，其最终分类层替换为生成 512 维嵌入的投影头。选择 EfficientNetV2-S 作为图像编码器，是因为其复合缩放设计提供了良好的准确率/效率权衡，适合可用的 6 GB GPU 显存，且已广泛用于医学图像分类（包括甲状腺超声）</w:t>
+      </w:r>
+      <w:r/>
+      <w:hyperlink w:anchor="_Ref8">
+        <w:r>
+          <w:rPr>
+            <w:color w:val="0563C1"/>
+            <w:u w:val="single"/>
+          </w:rPr>
+          <w:t>8</w:t>
+        </w:r>
+      </w:hyperlink>
+      <w:r/>
+      <w:r>
+        <w:t>；我们未进行架构搜索，其他主干可能有不同表现（见第 4 节"局限性"）。临床编码器为多层感知机，将五维临床向量（TI-RADS 总分、结节宽、结节高、年龄、性别）映射为 64 维嵌入。两个嵌入拼接后送入隐藏维数为 256 和 128、dropout 为 0.3 的预测头，产生恶性概率。比较了三种消融配置：纯图像（临床分支禁用）、纯临床（图像分支禁用）和融合（两个分支均启用）。</w:t>
       </w:r>
     </w:p>
     <w:p>
@@ -260,7 +544,35 @@
         <w:spacing w:after="120"/>
       </w:pPr>
       <w:r>
-        <w:t>判别力通过 AUC 量化，95% 置信区间由自助法重抽样获得（n = 2,000 个样本）。灵敏度、特异度和准确率在统一应用于内部和外部测试集的固定 0.5 决策阈值下报告。校准通过期望校准误差（ECE，10 个分箱）量化。临床效用通过决策曲线分析（DCA）评估，报告各阈值概率下的净收益。报告遵循 STARD 2015 [15] 和 TRIPOD+AI [16] 清单。</w:t>
+        <w:t xml:space="preserve">判别力通过 AUC 量化，95% 置信区间由自助法重抽样获得（n = 2,000 个样本）。灵敏度、特异度和准确率在统一应用于内部和外部测试集的固定 0.5 决策阈值下报告。校准通过期望校准误差（ECE，10 个分箱）量化。临床效用通过决策曲线分析（DCA）评估，报告各阈值概率下的净收益。报告遵循 STARD 2015 </w:t>
+      </w:r>
+      <w:r/>
+      <w:hyperlink w:anchor="_Ref15">
+        <w:r>
+          <w:rPr>
+            <w:color w:val="0563C1"/>
+            <w:u w:val="single"/>
+          </w:rPr>
+          <w:t>15</w:t>
+        </w:r>
+      </w:hyperlink>
+      <w:r/>
+      <w:r>
+        <w:t xml:space="preserve"> 和 TRIPOD+AI </w:t>
+      </w:r>
+      <w:r/>
+      <w:hyperlink w:anchor="_Ref16">
+        <w:r>
+          <w:rPr>
+            <w:color w:val="0563C1"/>
+            <w:u w:val="single"/>
+          </w:rPr>
+          <w:t>16</w:t>
+        </w:r>
+      </w:hyperlink>
+      <w:r/>
+      <w:r>
+        <w:t xml:space="preserve"> 清单。</w:t>
       </w:r>
     </w:p>
     <w:p>
@@ -5932,7 +6244,47 @@
         <w:t>域漂移是转化的核心障碍。</w:t>
       </w:r>
       <w:r>
-        <w:t xml:space="preserve"> 从 0.920 到 0.713 的外部下降值得强调。TN5000 和 TN3K 由不同机构的不同设备采集，标签患病率也显著不同（恶性 71.5% 对 34.6%），这在一定程度上解释了固定工作阈值下灵敏度的相应下降（内部 91.1% 降至官方 TN3K 测试的 51.3%）。第二个外部队列证实了这种漂移的幅度具有队列特异性：应用于 Thy-Wise 时，单数据集模型的结节级 AUC 进一步降至 0.608（见 3.4 节）。域适应文献中已报道过超声模型跨设备迁移时的类似性能退化 [17,18]。我们的结果支持了"单数据集 AUC 显著高估真实世界性能"这一日益形成的共识，并强化了 TRIPOD+AI 关于外部验证是部署前提的建议 [16]。</w:t>
+        <w:t xml:space="preserve"> 从 0.920 到 0.713 的外部下降值得强调。TN5000 和 TN3K 由不同机构的不同设备采集，标签患病率也显著不同（恶性 71.5% 对 34.6%），这在一定程度上解释了固定工作阈值下灵敏度的相应下降（内部 91.1% 降至官方 TN3K 测试的 51.3%）。第二个外部队列证实了这种漂移的幅度具有队列特异性：应用于 Thy-Wise 时，单数据集模型的结节级 AUC 进一步降至 0.608（见 3.4 节）。域适应文献中已报道过超声模型跨设备迁移时的类似性能退化 </w:t>
+      </w:r>
+      <w:r/>
+      <w:hyperlink w:anchor="_Ref17">
+        <w:r>
+          <w:rPr>
+            <w:color w:val="0563C1"/>
+            <w:u w:val="single"/>
+          </w:rPr>
+          <w:t>17</w:t>
+        </w:r>
+      </w:hyperlink>
+      <w:r>
+        <w:t>,</w:t>
+      </w:r>
+      <w:hyperlink w:anchor="_Ref18">
+        <w:r>
+          <w:rPr>
+            <w:color w:val="0563C1"/>
+            <w:u w:val="single"/>
+          </w:rPr>
+          <w:t>18</w:t>
+        </w:r>
+      </w:hyperlink>
+      <w:r/>
+      <w:r>
+        <w:t xml:space="preserve">。我们的结果支持了"单数据集 AUC 显著高估真实世界性能"这一日益形成的共识，并强化了 TRIPOD+AI 关于外部验证是部署前提的建议 </w:t>
+      </w:r>
+      <w:r/>
+      <w:hyperlink w:anchor="_Ref16">
+        <w:r>
+          <w:rPr>
+            <w:color w:val="0563C1"/>
+            <w:u w:val="single"/>
+          </w:rPr>
+          <w:t>16</w:t>
+        </w:r>
+      </w:hyperlink>
+      <w:r/>
+      <w:r>
+        <w:t>。</w:t>
       </w:r>
     </w:p>
     <w:p>
@@ -5960,7 +6312,47 @@
         <w:t>结构化临床特征补充但不主导图像特征。</w:t>
       </w:r>
       <w:r>
-        <w:t xml:space="preserve"> "结构化临床先验（专家 ACR TI-RADS 评分、结节宽和高、年龄和性别）在很大程度上独立于采集硬件并能稳定预测"这一假设在 ThyroidXL 消融中直接检验。融合模型相对纯图像取得了适度但一致的改善（结节级 AUC 0.947 对 0.939；AUPRC 0.939 对 0.930；特异度 0.940 对 0.909），而纯临床模型明显逊色（AUC 0.814）且校准差（ECE 0.248）。由此得出两点启示。其一，在这一单设备队列中图像特征主导分类任务，五项结构化特征的增量价值虽方向为正但很小。其二，仅靠临床特征不足以进行可靠的判别。这调和了"设备无关先验"的框架：结构化特征似乎是有用的补充信号，而非图像分析的替代品。融合增益在真正的跨设备域漂移下（图像统计退化而语义特征不应退化）是否会更大，仍是当前单设备 ThyroidXL 队列无法回答的开放问题，也是未来用多设备 TI-RADS 标注数据研究的方向。我们的框架还不同于依赖自由文本放射学报告 [19,20] 或对比增强序列 [21] 的多模态方法：它仅使用常规 B 型超声加结构化临床值，无需额外采集或报告转录，这有利于广泛临床部署。</w:t>
+        <w:t xml:space="preserve"> "结构化临床先验（专家 ACR TI-RADS 评分、结节宽和高、年龄和性别）在很大程度上独立于采集硬件并能稳定预测"这一假设在 ThyroidXL 消融中直接检验。融合模型相对纯图像取得了适度但一致的改善（结节级 AUC 0.947 对 0.939；AUPRC 0.939 对 0.930；特异度 0.940 对 0.909），而纯临床模型明显逊色（AUC 0.814）且校准差（ECE 0.248）。由此得出两点启示。其一，在这一单设备队列中图像特征主导分类任务，五项结构化特征的增量价值虽方向为正但很小。其二，仅靠临床特征不足以进行可靠的判别。这调和了"设备无关先验"的框架：结构化特征似乎是有用的补充信号，而非图像分析的替代品。融合增益在真正的跨设备域漂移下（图像统计退化而语义特征不应退化）是否会更大，仍是当前单设备 ThyroidXL 队列无法回答的开放问题，也是未来用多设备 TI-RADS 标注数据研究的方向。我们的框架还不同于依赖自由文本放射学报告 </w:t>
+      </w:r>
+      <w:r/>
+      <w:hyperlink w:anchor="_Ref19">
+        <w:r>
+          <w:rPr>
+            <w:color w:val="0563C1"/>
+            <w:u w:val="single"/>
+          </w:rPr>
+          <w:t>19</w:t>
+        </w:r>
+      </w:hyperlink>
+      <w:r>
+        <w:t>,</w:t>
+      </w:r>
+      <w:hyperlink w:anchor="_Ref20">
+        <w:r>
+          <w:rPr>
+            <w:color w:val="0563C1"/>
+            <w:u w:val="single"/>
+          </w:rPr>
+          <w:t>20</w:t>
+        </w:r>
+      </w:hyperlink>
+      <w:r/>
+      <w:r>
+        <w:t xml:space="preserve"> 或对比增强序列 </w:t>
+      </w:r>
+      <w:r/>
+      <w:hyperlink w:anchor="_Ref21">
+        <w:r>
+          <w:rPr>
+            <w:color w:val="0563C1"/>
+            <w:u w:val="single"/>
+          </w:rPr>
+          <w:t>21</w:t>
+        </w:r>
+      </w:hyperlink>
+      <w:r/>
+      <w:r>
+        <w:t xml:space="preserve"> 的多模态方法：它仅使用常规 B 型超声加结构化临床值，无需额外采集或报告转录，这有利于广泛临床部署。</w:t>
       </w:r>
     </w:p>
     <w:p>
@@ -5982,7 +6374,21 @@
         <w:t>与近期 ThyroidXL 研究比较。</w:t>
       </w:r>
       <w:r>
-        <w:t xml:space="preserve"> 自 ThyroidXL 可用以来，至少一个框架在该基准上使用纯图像输入报告了极高的患者级性能：一种带注意力多实例学习的区域与上下文感知融合报告了 ThyroidXL 上患者级测试 AUC 0.993 [22]。该方法与我们的方法在三个与临床转化相关的方面不同。其一，它在推理时需要结节分割掩膜（病灶聚焦分支与掩膜相乘），而我们的框架仅使用 B 型图像，因此在无自动或手动掩膜的情况下也可用。其二，它在每个患者内用学习到的注意力聚合帧，而我们使用固定平均聚合，更简单且避免额外的学习参数。</w:t>
+        <w:t xml:space="preserve"> 自 ThyroidXL 可用以来，至少一个框架在该基准上使用纯图像输入报告了极高的患者级性能：一种带注意力多实例学习的区域与上下文感知融合报告了 ThyroidXL 上患者级测试 AUC 0.993 </w:t>
+      </w:r>
+      <w:r/>
+      <w:hyperlink w:anchor="_Ref22">
+        <w:r>
+          <w:rPr>
+            <w:color w:val="0563C1"/>
+            <w:u w:val="single"/>
+          </w:rPr>
+          <w:t>22</w:t>
+        </w:r>
+      </w:hyperlink>
+      <w:r/>
+      <w:r>
+        <w:t>。该方法与我们的方法在三个与临床转化相关的方面不同。其一，它在推理时需要结节分割掩膜（病灶聚焦分支与掩膜相乘），而我们的框架仅使用 B 型图像，因此在无自动或手动掩膜的情况下也可用。其二，它在每个患者内用学习到的注意力聚合帧，而我们使用固定平均聚合，更简单且避免额外的学习参数。</w:t>
       </w:r>
     </w:p>
     <w:p>
@@ -6032,7 +6438,35 @@
         <w:t>局限性。</w:t>
       </w:r>
       <w:r>
-        <w:t xml:space="preserve"> 需承认几点局限。其一，数据集标签源自异构参考标准（TN5000 和 Thy-Wise 为活检确认的病理标签，TN3K 为已发表标签 [11]，ThyroidXL 为细胞学/病理标签 [13]），且各数据集患病率不同（图像/结节级恶性率分别为 71.5%、34.6%、27.3% 和 26.1%），使绝对指标的直接比较复杂化。其二，TN5000 在图像级分析，假设每张图像对应一个独立结节；尽管分组划分防止了泄漏，但未建模患者内相关性，而 Thy-Wise 恰好因结节由多帧表示而在结节级聚合。其三，融合消融在单设备队列（ThyroidXL，单超声系统采集）上进行，因此无法量化临床特征在真正跨设备域漂移下的增量价值；此处观察到的融合增益（Δ AUC +0.007）可能不适用于图像统计退化更显著的多设备场景。其四，我们仅评估单一架构（EfficientNetV2-S），其他主干可能表现不同。最后，尽管在多个公共数据集上进行了外部验证，但仍是回顾性的；临床部署前需要前瞻性、机构特定的评估。</w:t>
+        <w:t xml:space="preserve"> 需承认几点局限。其一，数据集标签源自异构参考标准（TN5000 和 Thy-Wise 为活检确认的病理标签，TN3K 为已发表标签 </w:t>
+      </w:r>
+      <w:r/>
+      <w:hyperlink w:anchor="_Ref11">
+        <w:r>
+          <w:rPr>
+            <w:color w:val="0563C1"/>
+            <w:u w:val="single"/>
+          </w:rPr>
+          <w:t>11</w:t>
+        </w:r>
+      </w:hyperlink>
+      <w:r/>
+      <w:r>
+        <w:t xml:space="preserve">，ThyroidXL 为细胞学/病理标签 </w:t>
+      </w:r>
+      <w:r/>
+      <w:hyperlink w:anchor="_Ref13">
+        <w:r>
+          <w:rPr>
+            <w:color w:val="0563C1"/>
+            <w:u w:val="single"/>
+          </w:rPr>
+          <w:t>13</w:t>
+        </w:r>
+      </w:hyperlink>
+      <w:r/>
+      <w:r>
+        <w:t>），且各数据集患病率不同（图像/结节级恶性率分别为 71.5%、34.6%、27.3% 和 26.1%），使绝对指标的直接比较复杂化。其二，TN5000 在图像级分析，假设每张图像对应一个独立结节；尽管分组划分防止了泄漏，但未建模患者内相关性，而 Thy-Wise 恰好因结节由多帧表示而在结节级聚合。其三，融合消融在单设备队列（ThyroidXL，单超声系统采集）上进行，因此无法量化临床特征在真正跨设备域漂移下的增量价值；此处观察到的融合增益（Δ AUC +0.007）可能不适用于图像统计退化更显著的多设备场景。其四，我们仅评估单一架构（EfficientNetV2-S），其他主干可能表现不同。最后，尽管在多个公共数据集上进行了外部验证，但仍是回顾性的；临床部署前需要前瞻性、机构特定的评估。</w:t>
       </w:r>
     </w:p>
     <w:p>
@@ -6046,7 +6480,21 @@
         <w:t>未来工作。</w:t>
       </w:r>
       <w:r>
-        <w:t xml:space="preserve"> 在单设备 ThyroidXL 队列上观察到的融合增益应在多设备、TI-RADS 标注数据上重新检验，以确定结构化临床先验在真正跨设备域漂移下是否能提供更大稳健性。将深度学习扩展到从超声图像自动提取 TI-RADS 描述符 [4]，可减少对专家评分的依赖，同时保留结构化特征先验，并增强框架的临床效用。</w:t>
+        <w:t xml:space="preserve"> 在单设备 ThyroidXL 队列上观察到的融合增益应在多设备、TI-RADS 标注数据上重新检验，以确定结构化临床先验在真正跨设备域漂移下是否能提供更大稳健性。将深度学习扩展到从超声图像自动提取 TI-RADS 描述符 </w:t>
+      </w:r>
+      <w:r/>
+      <w:hyperlink w:anchor="_Ref4">
+        <w:r>
+          <w:rPr>
+            <w:color w:val="0563C1"/>
+            <w:u w:val="single"/>
+          </w:rPr>
+          <w:t>4</w:t>
+        </w:r>
+      </w:hyperlink>
+      <w:r/>
+      <w:r>
+        <w:t>，可减少对专家评分的依赖，同时保留结构化特征先验，并增强框架的临床效用。</w:t>
       </w:r>
     </w:p>
     <w:p>
@@ -6078,7 +6526,75 @@
         <w:spacing w:after="120"/>
       </w:pPr>
       <w:r>
-        <w:t>- 数据可用性：TN5000（公开可用，[12]）、TN3K（Hugging Face，haifan-gong/TN3K，[10,11]）、Thy-Wise（figshare，DOI 10.6084/m9.figshare.20417895，CC BY 4.0，[14]）。ThyroidXL [13] 可在 https://huggingface.co/datasets/hunglc007/ThyroidXL 以受限访问获取；本研究已获授权并使用全部 11,635 张图像。 - 代码可用性：GitHub 仓库（投稿前插入 URL）。 - 伦理批准与知情同意：本研究仅使用各公共数据集已去标识化的图像，且各数据集自带研究使用许可；未收集任何新的患者数据，无需机构审查委员会批准。 - 经费：本工作未获任何资助机构的专项拨款。 - 利益冲突：作者声明无利益冲突。 - 注册与方案：本诊断准确率研究未注册，亦未事先准备研究方案。 - 患者与公众参与：本研究的方案设计、实施、报告或传播过程中无患者或公众成员参与。 - 样本量：使用了四个公共数据集的所有可用图像；因研究分析的是完整公共队列，未进行先验样本量计算。 - 人工智能使用：在撰写本手稿期间，作者使用 Claude（Anthropic）作为写作和代码辅助工具，帮助起草和修改手稿文本、协助数据处理与实验脚本编写，并帮助格式化参考文献列表。作者已审阅并核验所有 AI 辅助输出，对手稿内容负全责，并确认未使用任何 AI 工具生成科学结论、解读数据或作出研究设计或分析决策。所有方法和结果均独立产生、核验，可由所述公共数据集复现。 - 发表同意：不适用（未呈现任何个人的数据；所有图像均已去标识化且来自公共存储库）。 - 致谢：作者感谢 TN5000、TN3K、Thy-Wise 和 ThyroidXL 数据集的开发者公开提供数据。 - 作者贡献：投稿前由作者填写。</w:t>
+        <w:t>- 数据可用性：TN5000（公开可用，</w:t>
+      </w:r>
+      <w:r/>
+      <w:hyperlink w:anchor="_Ref12">
+        <w:r>
+          <w:rPr>
+            <w:color w:val="0563C1"/>
+            <w:u w:val="single"/>
+          </w:rPr>
+          <w:t>12</w:t>
+        </w:r>
+      </w:hyperlink>
+      <w:r/>
+      <w:r>
+        <w:t>）、TN3K（Hugging Face，haifan-gong/TN3K，</w:t>
+      </w:r>
+      <w:r/>
+      <w:hyperlink w:anchor="_Ref10">
+        <w:r>
+          <w:rPr>
+            <w:color w:val="0563C1"/>
+            <w:u w:val="single"/>
+          </w:rPr>
+          <w:t>10</w:t>
+        </w:r>
+      </w:hyperlink>
+      <w:r>
+        <w:t>,</w:t>
+      </w:r>
+      <w:hyperlink w:anchor="_Ref11">
+        <w:r>
+          <w:rPr>
+            <w:color w:val="0563C1"/>
+            <w:u w:val="single"/>
+          </w:rPr>
+          <w:t>11</w:t>
+        </w:r>
+      </w:hyperlink>
+      <w:r/>
+      <w:r>
+        <w:t>）、Thy-Wise（figshare，DOI 10.6084/m9.figshare.20417895，CC BY 4.0，</w:t>
+      </w:r>
+      <w:r/>
+      <w:hyperlink w:anchor="_Ref14">
+        <w:r>
+          <w:rPr>
+            <w:color w:val="0563C1"/>
+            <w:u w:val="single"/>
+          </w:rPr>
+          <w:t>14</w:t>
+        </w:r>
+      </w:hyperlink>
+      <w:r/>
+      <w:r>
+        <w:t xml:space="preserve">）。ThyroidXL </w:t>
+      </w:r>
+      <w:r/>
+      <w:hyperlink w:anchor="_Ref13">
+        <w:r>
+          <w:rPr>
+            <w:color w:val="0563C1"/>
+            <w:u w:val="single"/>
+          </w:rPr>
+          <w:t>13</w:t>
+        </w:r>
+      </w:hyperlink>
+      <w:r/>
+      <w:r>
+        <w:t xml:space="preserve"> 可在 https://huggingface.co/datasets/hunglc007/ThyroidXL 以受限访问获取；本研究已获授权并使用全部 11,635 张图像。 - 代码可用性：GitHub 仓库（投稿前插入 URL）。 - 伦理批准与知情同意：本研究仅使用各公共数据集已去标识化的图像，且各数据集自带研究使用许可；未收集任何新的患者数据，无需机构审查委员会批准。 - 经费：本工作未获任何资助机构的专项拨款。 - 利益冲突：作者声明无利益冲突。 - 注册与方案：本诊断准确率研究未注册，亦未事先准备研究方案。 - 患者与公众参与：本研究的方案设计、实施、报告或传播过程中无患者或公众成员参与。 - 样本量：使用了四个公共数据集的所有可用图像；因研究分析的是完整公共队列，未进行先验样本量计算。 - 人工智能使用：在撰写本手稿期间，作者使用 Claude（Anthropic）作为写作和代码辅助工具，帮助起草和修改手稿文本、协助数据处理与实验脚本编写，并帮助格式化参考文献列表。作者已审阅并核验所有 AI 辅助输出，对手稿内容负全责，并确认未使用任何 AI 工具生成科学结论、解读数据或作出研究设计或分析决策。所有方法和结果均独立产生、核验，可由所述公共数据集复现。 - 发表同意：不适用（未呈现任何个人的数据；所有图像均已去标识化且来自公共存储库）。 - 致谢：作者感谢 TN5000、TN3K、Thy-Wise 和 ThyroidXL 数据集的开发者公开提供数据。 - 作者贡献：投稿前由作者填写。</w:t>
       </w:r>
     </w:p>
     <w:p>
@@ -6257,6 +6773,8 @@
       <w:pPr>
         <w:ind w:left="504" w:hanging="504"/>
       </w:pPr>
+      <w:bookmarkStart w:id="59051" w:name="_Ref1"/>
+      <w:bookmarkEnd w:id="59051"/>
       <w:r>
         <w:t xml:space="preserve">1. </w:t>
       </w:r>
@@ -6268,6 +6786,8 @@
       <w:pPr>
         <w:ind w:left="504" w:hanging="504"/>
       </w:pPr>
+      <w:bookmarkStart w:id="31605" w:name="_Ref2"/>
+      <w:bookmarkEnd w:id="31605"/>
       <w:r>
         <w:t xml:space="preserve">2. </w:t>
       </w:r>
@@ -6279,6 +6799,8 @@
       <w:pPr>
         <w:ind w:left="504" w:hanging="504"/>
       </w:pPr>
+      <w:bookmarkStart w:id="55246" w:name="_Ref3"/>
+      <w:bookmarkEnd w:id="55246"/>
       <w:r>
         <w:t xml:space="preserve">3. </w:t>
       </w:r>
@@ -6290,6 +6812,8 @@
       <w:pPr>
         <w:ind w:left="504" w:hanging="504"/>
       </w:pPr>
+      <w:bookmarkStart w:id="50390" w:name="_Ref4"/>
+      <w:bookmarkEnd w:id="50390"/>
       <w:r>
         <w:t xml:space="preserve">4. </w:t>
       </w:r>
@@ -6301,6 +6825,8 @@
       <w:pPr>
         <w:ind w:left="504" w:hanging="504"/>
       </w:pPr>
+      <w:bookmarkStart w:id="83195" w:name="_Ref5"/>
+      <w:bookmarkEnd w:id="83195"/>
       <w:r>
         <w:t xml:space="preserve">5. </w:t>
       </w:r>
@@ -6312,6 +6838,8 @@
       <w:pPr>
         <w:ind w:left="504" w:hanging="504"/>
       </w:pPr>
+      <w:bookmarkStart w:id="92366" w:name="_Ref6"/>
+      <w:bookmarkEnd w:id="92366"/>
       <w:r>
         <w:t xml:space="preserve">6. </w:t>
       </w:r>
@@ -6323,6 +6851,8 @@
       <w:pPr>
         <w:ind w:left="504" w:hanging="504"/>
       </w:pPr>
+      <w:bookmarkStart w:id="33692" w:name="_Ref7"/>
+      <w:bookmarkEnd w:id="33692"/>
       <w:r>
         <w:t xml:space="preserve">7. </w:t>
       </w:r>
@@ -6334,6 +6864,8 @@
       <w:pPr>
         <w:ind w:left="504" w:hanging="504"/>
       </w:pPr>
+      <w:bookmarkStart w:id="17704" w:name="_Ref8"/>
+      <w:bookmarkEnd w:id="17704"/>
       <w:r>
         <w:t xml:space="preserve">8. </w:t>
       </w:r>
@@ -6345,6 +6877,8 @@
       <w:pPr>
         <w:ind w:left="504" w:hanging="504"/>
       </w:pPr>
+      <w:bookmarkStart w:id="71388" w:name="_Ref9"/>
+      <w:bookmarkEnd w:id="71388"/>
       <w:r>
         <w:t xml:space="preserve">9. </w:t>
       </w:r>
@@ -6356,6 +6890,8 @@
       <w:pPr>
         <w:ind w:left="504" w:hanging="504"/>
       </w:pPr>
+      <w:bookmarkStart w:id="39156" w:name="_Ref10"/>
+      <w:bookmarkEnd w:id="39156"/>
       <w:r>
         <w:t xml:space="preserve">10. </w:t>
       </w:r>
@@ -6367,6 +6903,8 @@
       <w:pPr>
         <w:ind w:left="504" w:hanging="504"/>
       </w:pPr>
+      <w:bookmarkStart w:id="12946" w:name="_Ref11"/>
+      <w:bookmarkEnd w:id="12946"/>
       <w:r>
         <w:t xml:space="preserve">11. </w:t>
       </w:r>
@@ -6378,6 +6916,8 @@
       <w:pPr>
         <w:ind w:left="504" w:hanging="504"/>
       </w:pPr>
+      <w:bookmarkStart w:id="67420" w:name="_Ref12"/>
+      <w:bookmarkEnd w:id="67420"/>
       <w:r>
         <w:t xml:space="preserve">12. </w:t>
       </w:r>
@@ -6389,6 +6929,8 @@
       <w:pPr>
         <w:ind w:left="504" w:hanging="504"/>
       </w:pPr>
+      <w:bookmarkStart w:id="83000" w:name="_Ref13"/>
+      <w:bookmarkEnd w:id="83000"/>
       <w:r>
         <w:t xml:space="preserve">13. </w:t>
       </w:r>
@@ -6400,6 +6942,8 @@
       <w:pPr>
         <w:ind w:left="504" w:hanging="504"/>
       </w:pPr>
+      <w:bookmarkStart w:id="45288" w:name="_Ref14"/>
+      <w:bookmarkEnd w:id="45288"/>
       <w:r>
         <w:t xml:space="preserve">14. </w:t>
       </w:r>
@@ -6411,6 +6955,8 @@
       <w:pPr>
         <w:ind w:left="504" w:hanging="504"/>
       </w:pPr>
+      <w:bookmarkStart w:id="89237" w:name="_Ref15"/>
+      <w:bookmarkEnd w:id="89237"/>
       <w:r>
         <w:t xml:space="preserve">15. </w:t>
       </w:r>
@@ -6422,6 +6968,8 @@
       <w:pPr>
         <w:ind w:left="504" w:hanging="504"/>
       </w:pPr>
+      <w:bookmarkStart w:id="53520" w:name="_Ref16"/>
+      <w:bookmarkEnd w:id="53520"/>
       <w:r>
         <w:t xml:space="preserve">16. </w:t>
       </w:r>
@@ -6433,6 +6981,8 @@
       <w:pPr>
         <w:ind w:left="504" w:hanging="504"/>
       </w:pPr>
+      <w:bookmarkStart w:id="51592" w:name="_Ref17"/>
+      <w:bookmarkEnd w:id="51592"/>
       <w:r>
         <w:t xml:space="preserve">17. </w:t>
       </w:r>
@@ -6444,6 +6994,8 @@
       <w:pPr>
         <w:ind w:left="504" w:hanging="504"/>
       </w:pPr>
+      <w:bookmarkStart w:id="52071" w:name="_Ref18"/>
+      <w:bookmarkEnd w:id="52071"/>
       <w:r>
         <w:t xml:space="preserve">18. </w:t>
       </w:r>
@@ -6455,6 +7007,8 @@
       <w:pPr>
         <w:ind w:left="504" w:hanging="504"/>
       </w:pPr>
+      <w:bookmarkStart w:id="85301" w:name="_Ref19"/>
+      <w:bookmarkEnd w:id="85301"/>
       <w:r>
         <w:t xml:space="preserve">19. </w:t>
       </w:r>
@@ -6466,6 +7020,8 @@
       <w:pPr>
         <w:ind w:left="504" w:hanging="504"/>
       </w:pPr>
+      <w:bookmarkStart w:id="96361" w:name="_Ref20"/>
+      <w:bookmarkEnd w:id="96361"/>
       <w:r>
         <w:t xml:space="preserve">20. </w:t>
       </w:r>
@@ -6477,6 +7033,8 @@
       <w:pPr>
         <w:ind w:left="504" w:hanging="504"/>
       </w:pPr>
+      <w:bookmarkStart w:id="70793" w:name="_Ref21"/>
+      <w:bookmarkEnd w:id="70793"/>
       <w:r>
         <w:t xml:space="preserve">21. </w:t>
       </w:r>
@@ -6488,6 +7046,8 @@
       <w:pPr>
         <w:ind w:left="504" w:hanging="504"/>
       </w:pPr>
+      <w:bookmarkStart w:id="70300" w:name="_Ref22"/>
+      <w:bookmarkEnd w:id="70300"/>
       <w:r>
         <w:t xml:space="preserve">22. </w:t>
       </w:r>

</xml_diff>

<commit_message>
docx: render table footnote markers (^b^ etc) as superscripts
Table cells like 750^b^ now render as superscript letters (750b) instead of
showing literal ^b^ text; table footnote paragraphs (^a^ Each TN5000...)
render the marker as a superscript letter followed by normal footnote text.
Verified: 5 superscript runs in each of manuscript.docx and manuscript_zh.docx.
</commit_message>
<xml_diff>
--- a/paper/output/doc/manuscript_zh.docx
+++ b/paper/output/doc/manuscript_zh.docx
@@ -874,6 +874,14 @@
               </w:rPr>
               <w:t>5,000</w:t>
             </w:r>
+            <w:r>
+              <w:rPr>
+                <w:rFonts w:ascii="Times New Roman" w:hAnsi="Times New Roman"/>
+                <w:sz w:val="18"/>
+                <w:vertAlign w:val="superscript"/>
+              </w:rPr>
+              <w:t>a</w:t>
+            </w:r>
           </w:p>
         </w:tc>
         <w:tc>
@@ -1195,6 +1203,14 @@
               </w:rPr>
               <w:t>3,500 / 750 / 750</w:t>
             </w:r>
+            <w:r>
+              <w:rPr>
+                <w:rFonts w:ascii="Times New Roman" w:hAnsi="Times New Roman"/>
+                <w:sz w:val="18"/>
+                <w:vertAlign w:val="superscript"/>
+              </w:rPr>
+              <w:t>b</w:t>
+            </w:r>
           </w:p>
         </w:tc>
         <w:tc>
@@ -1216,6 +1232,14 @@
               </w:rPr>
               <w:t>— / — / 614</w:t>
             </w:r>
+            <w:r>
+              <w:rPr>
+                <w:rFonts w:ascii="Times New Roman" w:hAnsi="Times New Roman"/>
+                <w:sz w:val="18"/>
+                <w:vertAlign w:val="superscript"/>
+              </w:rPr>
+              <w:t>c</w:t>
+            </w:r>
           </w:p>
         </w:tc>
         <w:tc>
@@ -1257,6 +1281,14 @@
                 <w:sz w:val="18"/>
               </w:rPr>
               <w:t>8,615 / 926 / 2,094</w:t>
+            </w:r>
+            <w:r>
+              <w:rPr>
+                <w:rFonts w:ascii="Times New Roman" w:hAnsi="Times New Roman"/>
+                <w:sz w:val="18"/>
+                <w:vertAlign w:val="superscript"/>
+              </w:rPr>
+              <w:t>d</w:t>
             </w:r>
           </w:p>
         </w:tc>
@@ -1694,9 +1726,17 @@
     <w:p>
       <w:pPr>
         <w:spacing w:after="120"/>
+        <w:ind w:left="288"/>
       </w:pPr>
       <w:r>
-        <w:t>^a^ 每张 TN5000 图像对应一个独立结节；文件名作为分组划分的患者标识符。 ^b^ 患者级分组随机划分（70/15/15，种子 = 42）。 ^c^ TN3K 官方测试划分。联合训练使用 TN3K 训练集（n = 2,879）训练、官方测试集评估。 ^d^ ThyroidXL 官方开发队列在患者级分为训练/验证（90/10，种子 = 42）；官方测试队列（739 个结节）保留。</w:t>
+        <w:rPr>
+          <w:sz w:val="18"/>
+          <w:vertAlign w:val="superscript"/>
+        </w:rPr>
+        <w:t>a</w:t>
+      </w:r>
+      <w:r>
+        <w:t xml:space="preserve"> 每张 TN5000 图像对应一个独立结节；文件名作为分组划分的患者标识符。 ^b^ 患者级分组随机划分（70/15/15，种子 = 42）。 ^c^ TN3K 官方测试划分。联合训练使用 TN3K 训练集（n = 2,879）训练、官方测试集评估。 ^d^ ThyroidXL 官方开发队列在患者级分为训练/验证（90/10，种子 = 42）；官方测试队列（739 个结节）保留。</w:t>
       </w:r>
     </w:p>
     <w:p>
@@ -2353,6 +2393,14 @@
               </w:rPr>
               <w:t>TN3K 外部（完整队列）</w:t>
             </w:r>
+            <w:r>
+              <w:rPr>
+                <w:rFonts w:ascii="Times New Roman" w:hAnsi="Times New Roman"/>
+                <w:sz w:val="18"/>
+                <w:vertAlign w:val="superscript"/>
+              </w:rPr>
+              <w:t>a</w:t>
+            </w:r>
           </w:p>
         </w:tc>
         <w:tc>
@@ -3708,9 +3756,17 @@
     <w:p>
       <w:pPr>
         <w:spacing w:after="120"/>
+        <w:ind w:left="288"/>
       </w:pPr>
       <w:r>
-        <w:t>^a^ TN3K 完整队列 AUC 仅用于域漂移说明；匹配 Δ 对两个模型均使用官方测试划分（n = 614）。</w:t>
+        <w:rPr>
+          <w:sz w:val="18"/>
+          <w:vertAlign w:val="superscript"/>
+        </w:rPr>
+        <w:t>a</w:t>
+      </w:r>
+      <w:r>
+        <w:t xml:space="preserve"> TN3K 完整队列 AUC 仅用于域漂移说明；匹配 Δ 对两个模型均使用官方测试划分（n = 614）。</w:t>
       </w:r>
     </w:p>
     <w:p>

</xml_diff>